<commit_message>
Solution Overview EN/DE: standard (eLeDia default) preset in chat screenshots, remove horizontal rules, captions use corporate caption style
</commit_message>
<xml_diff>
--- a/public/blocks/elediaaitutor/docs/eLeDia.ai-Tutor_Solution-Overview_DE.docx
+++ b/public/blocks/elediaaitutor/docs/eLeDia.ai-Tutor_Solution-Overview_DE.docx
@@ -839,7 +839,7 @@
     </w:p>
     <w:p>
       <w:pPr>
-        <w:pStyle w:val="CaptionedFigure"/>
+        <w:pStyle w:val="Standard"/>
         <w:jc w:val="center"/>
       </w:pPr>
       <w:r>
@@ -887,18 +887,11 @@
     </w:p>
     <w:p>
       <w:pPr>
-        <w:pStyle w:val="ImageCaption"/>
+        <w:pStyle w:val="Beschriftung"/>
         <w:jc w:val="center"/>
       </w:pPr>
       <w:r>
         <w:t xml:space="preserve">Der eLeDia.ai Tutor direkt im Moodle-Kurs — Begrüßung, Ein-Klick-Vorschlagsfragen, die Auswahl Erklären / Nur Hinweise / Abfragen und das Eingabefeld.</w:t>
-      </w:r>
-    </w:p>
-    <w:p>
-      <w:r>
-        <w:pict>
-          <v:rect style="width:0;height:1.5pt" o:hralign="center" o:hrstd="t" o:hr="t"/>
-        </w:pict>
       </w:r>
     </w:p>
     <w:bookmarkEnd w:id="26"/>
@@ -1240,13 +1233,13 @@
     </w:p>
     <w:p>
       <w:pPr>
-        <w:pStyle w:val="CaptionedFigure"/>
+        <w:pStyle w:val="Standard"/>
         <w:jc w:val="center"/>
       </w:pPr>
       <w:r>
         <w:drawing>
           <wp:inline>
-            <wp:extent cx="5579999" cy="3804545"/>
+            <wp:extent cx="5579999" cy="4142727"/>
             <wp:effectExtent b="0" l="0" r="0" t="0"/>
             <wp:docPr descr="Die Voreinstellung: ein angedocktes, schwebendes Panel, das sich über jeder Kursseite öffnet." title="" id="28" name="Picture"/>
             <a:graphic>
@@ -1267,7 +1260,7 @@
                   <pic:spPr bwMode="auto">
                     <a:xfrm>
                       <a:off x="0" y="0"/>
-                      <a:ext cx="5579999" cy="3804545"/>
+                      <a:ext cx="5579999" cy="4142727"/>
                     </a:xfrm>
                     <a:prstGeom prst="rect">
                       <a:avLst/>
@@ -1288,18 +1281,11 @@
     </w:p>
     <w:p>
       <w:pPr>
-        <w:pStyle w:val="ImageCaption"/>
+        <w:pStyle w:val="Beschriftung"/>
         <w:jc w:val="center"/>
       </w:pPr>
       <w:r>
         <w:t xml:space="preserve">Die Voreinstellung: ein angedocktes, schwebendes Panel, das sich über jeder Kursseite öffnet.</w:t>
-      </w:r>
-    </w:p>
-    <w:p>
-      <w:r>
-        <w:pict>
-          <v:rect style="width:0;height:1.5pt" o:hralign="center" o:hrstd="t" o:hr="t"/>
-        </w:pict>
       </w:r>
     </w:p>
     <w:bookmarkEnd w:id="30"/>
@@ -1428,7 +1414,7 @@
     </w:p>
     <w:p>
       <w:pPr>
-        <w:pStyle w:val="CaptionedFigure"/>
+        <w:pStyle w:val="Standard"/>
         <w:jc w:val="center"/>
       </w:pPr>
       <w:r>
@@ -1476,7 +1462,7 @@
     </w:p>
     <w:p>
       <w:pPr>
-        <w:pStyle w:val="ImageCaption"/>
+        <w:pStyle w:val="Beschriftung"/>
         <w:jc w:val="center"/>
       </w:pPr>
       <w:r>
@@ -1723,7 +1709,7 @@
     </w:p>
     <w:p>
       <w:pPr>
-        <w:pStyle w:val="CaptionedFigure"/>
+        <w:pStyle w:val="Standard"/>
         <w:jc w:val="center"/>
       </w:pPr>
       <w:r>
@@ -1771,7 +1757,7 @@
     </w:p>
     <w:p>
       <w:pPr>
-        <w:pStyle w:val="ImageCaption"/>
+        <w:pStyle w:val="Beschriftung"/>
         <w:jc w:val="center"/>
       </w:pPr>
       <w:r>
@@ -1890,13 +1876,6 @@
       </w:r>
       <w:r>
         <w:t xml:space="preserve">Custom-CSS für pixelgenaue Kontrolle.</w:t>
-      </w:r>
-    </w:p>
-    <w:p>
-      <w:r>
-        <w:pict>
-          <v:rect style="width:0;height:1.5pt" o:hralign="center" o:hrstd="t" o:hr="t"/>
-        </w:pict>
       </w:r>
     </w:p>
     <w:bookmarkEnd w:id="42"/>
@@ -2178,7 +2157,7 @@
     </w:p>
     <w:p>
       <w:pPr>
-        <w:pStyle w:val="CaptionedFigure"/>
+        <w:pStyle w:val="Standard"/>
         <w:jc w:val="center"/>
       </w:pPr>
       <w:r>
@@ -2226,18 +2205,11 @@
     </w:p>
     <w:p>
       <w:pPr>
-        <w:pStyle w:val="ImageCaption"/>
+        <w:pStyle w:val="Beschriftung"/>
         <w:jc w:val="center"/>
       </w:pPr>
       <w:r>
         <w:t xml:space="preserve">Die Website-Einstellungen des Blocks: die sichere Verbindung zum RAG-/Tutor-Dienst und der zentrale Ort, an dem die Administration den Tutor konfiguriert und festlegt, welche Einstellungen Lehrende pro Kurs überschreiben dürfen.</w:t>
-      </w:r>
-    </w:p>
-    <w:p>
-      <w:r>
-        <w:pict>
-          <v:rect style="width:0;height:1.5pt" o:hralign="center" o:hrstd="t" o:hr="t"/>
-        </w:pict>
       </w:r>
     </w:p>
     <w:bookmarkEnd w:id="47"/>
@@ -2357,13 +2329,6 @@
       </w:r>
       <w:r>
         <w:t xml:space="preserve">persönlichen, berechtigungsgebundenen Token.</w:t>
-      </w:r>
-    </w:p>
-    <w:p>
-      <w:r>
-        <w:pict>
-          <v:rect style="width:0;height:1.5pt" o:hralign="center" o:hrstd="t" o:hr="t"/>
-        </w:pict>
       </w:r>
     </w:p>
     <w:bookmarkEnd w:id="49"/>
@@ -2611,13 +2576,6 @@
         <w:t xml:space="preserve">„Wie stehe ich bisher da — wie sind meine aktuellen Noten?”</w:t>
       </w:r>
     </w:p>
-    <w:p>
-      <w:r>
-        <w:pict>
-          <v:rect style="width:0;height:1.5pt" o:hralign="center" o:hrstd="t" o:hr="t"/>
-        </w:pict>
-      </w:r>
-    </w:p>
     <w:bookmarkEnd w:id="51"/>
     <w:bookmarkStart w:id="52" w:name="X848442db77599423eaa6f878d6cf20583f3ea0e"/>
     <w:p>
@@ -2822,13 +2780,6 @@
         <w:t xml:space="preserve">unterstützen.</w:t>
       </w:r>
     </w:p>
-    <w:p>
-      <w:r>
-        <w:pict>
-          <v:rect style="width:0;height:1.5pt" o:hralign="center" o:hrstd="t" o:hr="t"/>
-        </w:pict>
-      </w:r>
-    </w:p>
     <w:bookmarkEnd w:id="52"/>
     <w:bookmarkStart w:id="56" w:name="einblick-für-lehrende-fragen-analytik"/>
     <w:p>
@@ -3008,7 +2959,7 @@
     </w:p>
     <w:p>
       <w:pPr>
-        <w:pStyle w:val="CaptionedFigure"/>
+        <w:pStyle w:val="Standard"/>
         <w:jc w:val="center"/>
       </w:pPr>
       <w:r>
@@ -3056,18 +3007,11 @@
     </w:p>
     <w:p>
       <w:pPr>
-        <w:pStyle w:val="ImageCaption"/>
+        <w:pStyle w:val="Beschriftung"/>
         <w:jc w:val="center"/>
       </w:pPr>
       <w:r>
         <w:t xml:space="preserve">Der datenschutzsichere Analysebericht: Kennzahlen auf einen Blick, Verständnis-Hotspots nach Thema, der Verlauf „Fragen pro Tag” und die namenlose Liste jüngster Fragen.</w:t>
-      </w:r>
-    </w:p>
-    <w:p>
-      <w:r>
-        <w:pict>
-          <v:rect style="width:0;height:1.5pt" o:hralign="center" o:hrstd="t" o:hr="t"/>
-        </w:pict>
       </w:r>
     </w:p>
     <w:bookmarkEnd w:id="56"/>
@@ -3215,13 +3159,6 @@
         <w:t xml:space="preserve">die Möglichkeit, Anforderungen an Datenstandort und Beschaffung zu erfüllen.</w:t>
       </w:r>
     </w:p>
-    <w:p>
-      <w:r>
-        <w:pict>
-          <v:rect style="width:0;height:1.5pt" o:hralign="center" o:hrstd="t" o:hr="t"/>
-        </w:pict>
-      </w:r>
-    </w:p>
     <w:bookmarkEnd w:id="57"/>
     <w:bookmarkStart w:id="61" w:name="sicherheit-datenschutz-datensouveränität"/>
     <w:p>
@@ -3422,7 +3359,7 @@
     </w:p>
     <w:p>
       <w:pPr>
-        <w:pStyle w:val="CaptionedFigure"/>
+        <w:pStyle w:val="Standard"/>
         <w:jc w:val="center"/>
       </w:pPr>
       <w:r>
@@ -3470,18 +3407,11 @@
     </w:p>
     <w:p>
       <w:pPr>
-        <w:pStyle w:val="ImageCaption"/>
+        <w:pStyle w:val="Beschriftung"/>
         <w:jc w:val="center"/>
       </w:pPr>
       <w:r>
         <w:t xml:space="preserve">Einwilligung vor der ersten Nutzung: Bevor die erste Nachricht gesendet wird, lesen und bestätigen Lernende Ihre Datenschutzhinweise; sie können sie jederzeit erneut einsehen und ihre Daten löschen.</w:t>
-      </w:r>
-    </w:p>
-    <w:p>
-      <w:r>
-        <w:pict>
-          <v:rect style="width:0;height:1.5pt" o:hralign="center" o:hrstd="t" o:hr="t"/>
-        </w:pict>
       </w:r>
     </w:p>
     <w:bookmarkEnd w:id="61"/>
@@ -3496,7 +3426,7 @@
     </w:p>
     <w:p>
       <w:pPr>
-        <w:pStyle w:val="CaptionedFigure"/>
+        <w:pStyle w:val="Standard"/>
         <w:jc w:val="center"/>
       </w:pPr>
       <w:r>
@@ -3544,7 +3474,7 @@
     </w:p>
     <w:p>
       <w:pPr>
-        <w:pStyle w:val="ImageCaption"/>
+        <w:pStyle w:val="Beschriftung"/>
         <w:jc w:val="center"/>
       </w:pPr>
       <w:r>
@@ -3729,13 +3659,6 @@
       </w:r>
       <w:r>
         <w:t xml:space="preserve">LiteLLM-Gateway) und liefert eine fundierte, mit Quellen belegte Antwort.</w:t>
-      </w:r>
-    </w:p>
-    <w:p>
-      <w:r>
-        <w:pict>
-          <v:rect style="width:0;height:1.5pt" o:hralign="center" o:hrstd="t" o:hr="t"/>
-        </w:pict>
       </w:r>
     </w:p>
     <w:bookmarkEnd w:id="65"/>
@@ -3967,13 +3890,6 @@
         </w:tc>
       </w:tr>
     </w:tbl>
-    <w:p>
-      <w:r>
-        <w:pict>
-          <v:rect style="width:0;height:1.5pt" o:hralign="center" o:hrstd="t" o:hr="t"/>
-        </w:pict>
-      </w:r>
-    </w:p>
     <w:bookmarkEnd w:id="66"/>
     <w:bookmarkStart w:id="67" w:name="warum-eledia"/>
     <w:p>
@@ -4181,13 +4097,6 @@
         <w:t xml:space="preserve">, einem spezialisierten Moodle-Partner.</w:t>
       </w:r>
     </w:p>
-    <w:p>
-      <w:r>
-        <w:pict>
-          <v:rect style="width:0;height:1.5pt" o:hralign="center" o:hrstd="t" o:hr="t"/>
-        </w:pict>
-      </w:r>
-    </w:p>
     <w:bookmarkEnd w:id="67"/>
     <w:bookmarkStart w:id="68" w:name="in-einfachen-worten-glossar-box"/>
     <w:p>
@@ -4348,13 +4257,6 @@
       </w:r>
       <w:r>
         <w:t xml:space="preserve">Modellanbieter bietet — so kann das Modell frei gewählt oder gewechselt werden.</w:t>
-      </w:r>
-    </w:p>
-    <w:p>
-      <w:r>
-        <w:pict>
-          <v:rect style="width:0;height:1.5pt" o:hralign="center" o:hrstd="t" o:hr="t"/>
-        </w:pict>
       </w:r>
     </w:p>
     <w:p>

</xml_diff>

<commit_message>
Solution Overview EN/DE: fix truncated closing sentence (no more trailing comma); keep hyphenated compounds intact
</commit_message>
<xml_diff>
--- a/public/blocks/elediaaitutor/docs/eLeDia.ai-Tutor_Solution-Overview_DE.docx
+++ b/public/blocks/elediaaitutor/docs/eLeDia.ai-Tutor_Solution-Overview_DE.docx
@@ -3196,19 +3196,19 @@
         <w:t xml:space="preserve"> </w:t>
       </w:r>
       <w:r>
-        <w:t xml:space="preserve">Moodle-Tokens und Modell-/Anbieter-</w:t>
-      </w:r>
-      <w:r>
-        <w:t xml:space="preserve"> </w:t>
-      </w:r>
-      <w:r>
-        <w:t xml:space="preserve">Zugangsdaten gelangen nie in den Browser; die App der lernenden Person spricht</w:t>
-      </w:r>
-      <w:r>
-        <w:t xml:space="preserve"> </w:t>
-      </w:r>
-      <w:r>
-        <w:t xml:space="preserve">ausschließlich mit Moodle.</w:t>
+        <w:t xml:space="preserve">Moodle-Tokens und</w:t>
+      </w:r>
+      <w:r>
+        <w:t xml:space="preserve"> </w:t>
+      </w:r>
+      <w:r>
+        <w:t xml:space="preserve">Modell-/Anbieter-Zugangsdaten gelangen nie in den Browser; die App der</w:t>
+      </w:r>
+      <w:r>
+        <w:t xml:space="preserve"> </w:t>
+      </w:r>
+      <w:r>
+        <w:t xml:space="preserve">lernenden Person spricht ausschließlich mit Moodle.</w:t>
       </w:r>
     </w:p>
     <w:p>
@@ -4264,7 +4264,53 @@
         <w:pStyle w:val="FirstParagraph"/>
       </w:pPr>
       <w:r>
-        <w:t xml:space="preserve">*Erstellt zur Vertriebsunterstützung. Technische Referenzen — die Plugin-README,</w:t>
+        <w:rPr>
+          <w:i/>
+          <w:iCs/>
+        </w:rPr>
+        <w:t xml:space="preserve">Erstellt zur Vertriebsunterstützung. Technische Referenzen — die Plugin-README,</w:t>
+      </w:r>
+      <w:r>
+        <w:rPr>
+          <w:i/>
+          <w:iCs/>
+        </w:rPr>
+        <w:t xml:space="preserve"> </w:t>
+      </w:r>
+      <w:r>
+        <w:rPr>
+          <w:i/>
+          <w:iCs/>
+        </w:rPr>
+        <w:t xml:space="preserve">die Administrations-/Integrationsleitfäden und die Spezifikation des</w:t>
+      </w:r>
+      <w:r>
+        <w:rPr>
+          <w:i/>
+          <w:iCs/>
+        </w:rPr>
+        <w:t xml:space="preserve"> </w:t>
+      </w:r>
+      <w:r>
+        <w:rPr>
+          <w:i/>
+          <w:iCs/>
+        </w:rPr>
+        <w:t xml:space="preserve">RAG-/Tutor-MCP-Servers — begleiten dieses Dokument für Interessenten mit</w:t>
+      </w:r>
+      <w:r>
+        <w:rPr>
+          <w:i/>
+          <w:iCs/>
+        </w:rPr>
+        <w:t xml:space="preserve"> </w:t>
+      </w:r>
+      <w:r>
+        <w:rPr>
+          <w:i/>
+          <w:iCs/>
+        </w:rPr>
+        <w:t xml:space="preserve">Detailbedarf.</w:t>
       </w:r>
     </w:p>
     <w:bookmarkEnd w:id="68"/>

</xml_diff>